<commit_message>
Exemplo Projeto Clinica Psicologia INNERCARE PEC PETI PDTI .....
</commit_message>
<xml_diff>
--- a/04 Works/Avaliação - Projeto PETI e PDTI - Disciplina Gestão de Informação UniRuy Wyden .docx
+++ b/04 Works/Avaliação - Projeto PETI e PDTI - Disciplina Gestão de Informação UniRuy Wyden .docx
@@ -292,7 +292,23 @@
           <w:sz w:val="24"/>
           <w:szCs w:val="24"/>
         </w:rPr>
-        <w:t xml:space="preserve"> Projeto de </w:t>
+        <w:t xml:space="preserve"> </w:t>
+      </w:r>
+      <w:r>
+        <w:rPr>
+          <w:rFonts w:ascii="Times New Roman" w:hAnsi="Times New Roman" w:cs="Times New Roman"/>
+          <w:sz w:val="24"/>
+          <w:szCs w:val="24"/>
+        </w:rPr>
+        <w:t xml:space="preserve">PEC; </w:t>
+      </w:r>
+      <w:r>
+        <w:rPr>
+          <w:rFonts w:ascii="Times New Roman" w:hAnsi="Times New Roman" w:cs="Times New Roman"/>
+          <w:sz w:val="24"/>
+          <w:szCs w:val="24"/>
+        </w:rPr>
+        <w:t xml:space="preserve">Projeto de </w:t>
       </w:r>
       <w:r>
         <w:rPr>
@@ -3084,15 +3100,7 @@
         <w:sz w:val="20"/>
         <w:szCs w:val="20"/>
       </w:rPr>
-      <w:t xml:space="preserve"> - </w:t>
-    </w:r>
-    <w:r>
-      <w:rPr>
-        <w:rFonts w:ascii="Times New Roman" w:hAnsi="Times New Roman" w:cs="Times New Roman"/>
-        <w:sz w:val="20"/>
-        <w:szCs w:val="20"/>
-      </w:rPr>
-      <w:t>WYD6917 GESTÃO DE SISTEMAS DE INFORMAÇÃO</w:t>
+      <w:t xml:space="preserve"> - WYD6917 GESTÃO DE SISTEMAS DE INFORMAÇÃO</w:t>
     </w:r>
   </w:p>
 </w:ftr>
@@ -5222,6 +5230,7 @@
   <w:style w:type="character" w:default="1" w:styleId="Fontepargpadro">
     <w:name w:val="Default Paragraph Font"/>
     <w:uiPriority w:val="1"/>
+    <w:semiHidden/>
     <w:unhideWhenUsed/>
   </w:style>
   <w:style w:type="table" w:default="1" w:styleId="Tabelanormal">

</xml_diff>